<commit_message>
05-20-62123 assumptions email: undo four additions
At the engineer's request, the email is back to Statement of Problem n/a,
Project Cost without the breakdown or B/C, the original project
development summary without the severity index, and the Signal ID: N/A
bullet. The generator and Master reader additions behind them are
reverted with their tests. The construction window note stays.

Co-Authored-By: Claude Opus 5.5 <noreply@anthropic.com>
Claude-Session: https://claude.ai/code/session_01UzM4sZHfA2PkELFhftQzNK
</commit_message>
<xml_diff>
--- a/deliverables/05-20-62123/Assumptions Email - 41000076579 (05-20-62123 (TIP #HS-2005A)).docx
+++ b/deliverables/05-20-62123/Assumptions Email - 41000076579 (05-20-62123 (TIP #HS-2005A)).docx
@@ -107,6 +107,20 @@
         <w:rPr>
           <w:b/>
         </w:rPr>
+        <w:t xml:space="preserve">Signal ID: </w:t>
+      </w:r>
+      <w:r>
+        <w:t>N/A</w:t>
+      </w:r>
+    </w:p>
+    <w:p>
+      <w:pPr>
+        <w:pStyle w:val="ListBullet"/>
+      </w:pPr>
+      <w:r>
+        <w:rPr>
+          <w:b/>
+        </w:rPr>
         <w:t xml:space="preserve">Countermeasure: </w:t>
       </w:r>
       <w:r>
@@ -124,7 +138,7 @@
         <w:t xml:space="preserve">Statement of Problem: </w:t>
       </w:r>
       <w:r>
-        <w:t>Angle type crashes are occurring.</w:t>
+        <w:t>n/a</w:t>
       </w:r>
     </w:p>
     <w:p>
@@ -135,62 +149,10 @@
         <w:rPr>
           <w:b/>
         </w:rPr>
-        <w:t xml:space="preserve">Total Cost Estimate: </w:t>
+        <w:t xml:space="preserve">Project Cost: </w:t>
       </w:r>
       <w:r>
         <w:t>$278,000</w:t>
-      </w:r>
-    </w:p>
-    <w:p>
-      <w:pPr>
-        <w:pStyle w:val="ListBullet2"/>
-      </w:pPr>
-      <w:r>
-        <w:rPr>
-          <w:b w:val="0"/>
-        </w:rPr>
-      </w:r>
-      <w:r>
-        <w:t>Construction: $100,000</w:t>
-      </w:r>
-    </w:p>
-    <w:p>
-      <w:pPr>
-        <w:pStyle w:val="ListBullet2"/>
-      </w:pPr>
-      <w:r>
-        <w:rPr>
-          <w:b w:val="0"/>
-        </w:rPr>
-      </w:r>
-      <w:r>
-        <w:t>PE: $22,000</w:t>
-      </w:r>
-    </w:p>
-    <w:p>
-      <w:pPr>
-        <w:pStyle w:val="ListBullet2"/>
-      </w:pPr>
-      <w:r>
-        <w:rPr>
-          <w:b w:val="0"/>
-        </w:rPr>
-      </w:r>
-      <w:r>
-        <w:t>Companion funding: $156,000</w:t>
-      </w:r>
-    </w:p>
-    <w:p>
-      <w:pPr>
-        <w:pStyle w:val="ListBullet2"/>
-      </w:pPr>
-      <w:r>
-        <w:rPr>
-          <w:b w:val="0"/>
-        </w:rPr>
-      </w:r>
-      <w:r>
-        <w:t>B/C Ratio: 8.52</w:t>
       </w:r>
     </w:p>
     <w:p>
@@ -308,7 +270,7 @@
         <w:t xml:space="preserve">Project Dev Crash Summary: </w:t>
       </w:r>
       <w:r>
-        <w:t>8/1/2010 to 7/31/2020: 19 total crashes (0 K, 0 A, 1 B, 3 C, 15 PDO), 4 injury crashes, severity index 2.56. The Master Evaluation Spreadsheet crash history also lists CR = 3.16.</w:t>
+        <w:t>8/1/2010 to 7/31/2020: 19 total crashes (1 B, 3 C, 15 PDO), 4 total injury crashes; CR = 3.16 total injury crashes per the Master Evaluation Spreadsheet.</w:t>
       </w:r>
     </w:p>
     <w:p>

</xml_diff>